<commit_message>
ajuste reclassificacao rodadas cadastro
</commit_message>
<xml_diff>
--- a/anotacao/Rodadas e Classificação Brasileirão Série B 2026.docx
+++ b/anotacao/Rodadas e Classificação Brasileirão Série B 2026.docx
@@ -204,12 +204,25 @@
       </w:r>
     </w:p>
     <w:p>
-      <w:r>
+      <w:pPr>
+        <w:rPr>
+          <w:b/>
+          <w:bCs/>
+        </w:rPr>
+      </w:pPr>
+      <w:r>
+        <w:rPr>
+          <w:b/>
+          <w:bCs/>
+        </w:rPr>
         <w:t>Rodada 02 – 02/04/2026</w:t>
       </w:r>
     </w:p>
     <w:p>
       <w:r>
+        <w:rPr>
+          <w:noProof/>
+        </w:rPr>
         <w:lastRenderedPageBreak/>
         <w:drawing>
           <wp:inline distT="0" distB="0" distL="0" distR="0" wp14:anchorId="7F3070AF" wp14:editId="7B593E93">
@@ -250,6 +263,9 @@
     </w:p>
     <w:p>
       <w:r>
+        <w:rPr>
+          <w:noProof/>
+        </w:rPr>
         <w:lastRenderedPageBreak/>
         <w:drawing>
           <wp:inline distT="0" distB="0" distL="0" distR="0" wp14:anchorId="12384446" wp14:editId="139FFACA">
@@ -287,11 +303,206 @@
           </wp:inline>
         </w:drawing>
       </w:r>
+    </w:p>
+    <w:p>
+      <w:pPr>
+        <w:rPr>
+          <w:b/>
+          <w:bCs/>
+        </w:rPr>
+      </w:pPr>
+      <w:r>
+        <w:rPr>
+          <w:b/>
+          <w:bCs/>
+        </w:rPr>
+        <w:t>Rodada 03 – 04/04/2026</w:t>
+      </w:r>
+    </w:p>
+    <w:p>
+      <w:r>
+        <w:rPr>
+          <w:noProof/>
+        </w:rPr>
+        <w:lastRenderedPageBreak/>
+        <w:drawing>
+          <wp:inline distT="0" distB="0" distL="0" distR="0" wp14:anchorId="769CF72F" wp14:editId="23F595A5">
+            <wp:extent cx="6858000" cy="6430010"/>
+            <wp:effectExtent l="0" t="0" r="0" b="8890"/>
+            <wp:docPr id="6" name="Imagem 6" descr="Uma imagem contendo Interface gráfica do usuário&#10;&#10;Descrição gerada automaticamente"/>
+            <wp:cNvGraphicFramePr>
+              <a:graphicFrameLocks xmlns:a="http://schemas.openxmlformats.org/drawingml/2006/main" noChangeAspect="1"/>
+            </wp:cNvGraphicFramePr>
+            <a:graphic xmlns:a="http://schemas.openxmlformats.org/drawingml/2006/main">
+              <a:graphicData uri="http://schemas.openxmlformats.org/drawingml/2006/picture">
+                <pic:pic xmlns:pic="http://schemas.openxmlformats.org/drawingml/2006/picture">
+                  <pic:nvPicPr>
+                    <pic:cNvPr id="1" name=""/>
+                    <pic:cNvPicPr/>
+                  </pic:nvPicPr>
+                  <pic:blipFill>
+                    <a:blip r:embed="rId12"/>
+                    <a:stretch>
+                      <a:fillRect/>
+                    </a:stretch>
+                  </pic:blipFill>
+                  <pic:spPr>
+                    <a:xfrm>
+                      <a:off x="0" y="0"/>
+                      <a:ext cx="6858000" cy="6430010"/>
+                    </a:xfrm>
+                    <a:prstGeom prst="rect">
+                      <a:avLst/>
+                    </a:prstGeom>
+                  </pic:spPr>
+                </pic:pic>
+              </a:graphicData>
+            </a:graphic>
+          </wp:inline>
+        </w:drawing>
+      </w:r>
+    </w:p>
+    <w:p/>
+    <w:p>
+      <w:r>
+        <w:rPr>
+          <w:noProof/>
+        </w:rPr>
+        <w:lastRenderedPageBreak/>
+        <w:drawing>
+          <wp:inline distT="0" distB="0" distL="0" distR="0" wp14:anchorId="4202D029" wp14:editId="00F87D48">
+            <wp:extent cx="5730737" cy="7292972"/>
+            <wp:effectExtent l="0" t="0" r="3810" b="3810"/>
+            <wp:docPr id="7" name="Imagem 7" descr="Uma imagem contendo Tabela&#10;&#10;Descrição gerada automaticamente"/>
+            <wp:cNvGraphicFramePr>
+              <a:graphicFrameLocks xmlns:a="http://schemas.openxmlformats.org/drawingml/2006/main" noChangeAspect="1"/>
+            </wp:cNvGraphicFramePr>
+            <a:graphic xmlns:a="http://schemas.openxmlformats.org/drawingml/2006/main">
+              <a:graphicData uri="http://schemas.openxmlformats.org/drawingml/2006/picture">
+                <pic:pic xmlns:pic="http://schemas.openxmlformats.org/drawingml/2006/picture">
+                  <pic:nvPicPr>
+                    <pic:cNvPr id="1" name=""/>
+                    <pic:cNvPicPr/>
+                  </pic:nvPicPr>
+                  <pic:blipFill>
+                    <a:blip r:embed="rId13"/>
+                    <a:stretch>
+                      <a:fillRect/>
+                    </a:stretch>
+                  </pic:blipFill>
+                  <pic:spPr>
+                    <a:xfrm>
+                      <a:off x="0" y="0"/>
+                      <a:ext cx="5730737" cy="7292972"/>
+                    </a:xfrm>
+                    <a:prstGeom prst="rect">
+                      <a:avLst/>
+                    </a:prstGeom>
+                  </pic:spPr>
+                </pic:pic>
+              </a:graphicData>
+            </a:graphic>
+          </wp:inline>
+        </w:drawing>
+      </w:r>
+    </w:p>
+    <w:p>
+      <w:r>
+        <w:rPr>
+          <w:b/>
+          <w:bCs/>
+        </w:rPr>
+        <w:t>Rodada 03 – 04/04/2026 a 06/04/</w:t>
+      </w:r>
+      <w:r>
+        <w:t>2026</w:t>
+      </w:r>
+    </w:p>
+    <w:p>
+      <w:r>
+        <w:lastRenderedPageBreak/>
+        <w:drawing>
+          <wp:inline distT="0" distB="0" distL="0" distR="0" wp14:anchorId="6C1680E9" wp14:editId="697DEDDD">
+            <wp:extent cx="6858000" cy="6382385"/>
+            <wp:effectExtent l="0" t="0" r="0" b="0"/>
+            <wp:docPr id="8" name="Imagem 8" descr="Uma imagem contendo Tabela&#10;&#10;Descrição gerada automaticamente"/>
+            <wp:cNvGraphicFramePr>
+              <a:graphicFrameLocks xmlns:a="http://schemas.openxmlformats.org/drawingml/2006/main" noChangeAspect="1"/>
+            </wp:cNvGraphicFramePr>
+            <a:graphic xmlns:a="http://schemas.openxmlformats.org/drawingml/2006/main">
+              <a:graphicData uri="http://schemas.openxmlformats.org/drawingml/2006/picture">
+                <pic:pic xmlns:pic="http://schemas.openxmlformats.org/drawingml/2006/picture">
+                  <pic:nvPicPr>
+                    <pic:cNvPr id="1" name=""/>
+                    <pic:cNvPicPr/>
+                  </pic:nvPicPr>
+                  <pic:blipFill>
+                    <a:blip r:embed="rId14"/>
+                    <a:stretch>
+                      <a:fillRect/>
+                    </a:stretch>
+                  </pic:blipFill>
+                  <pic:spPr>
+                    <a:xfrm>
+                      <a:off x="0" y="0"/>
+                      <a:ext cx="6858000" cy="6382385"/>
+                    </a:xfrm>
+                    <a:prstGeom prst="rect">
+                      <a:avLst/>
+                    </a:prstGeom>
+                  </pic:spPr>
+                </pic:pic>
+              </a:graphicData>
+            </a:graphic>
+          </wp:inline>
+        </w:drawing>
+      </w:r>
+    </w:p>
+    <w:p>
+      <w:r>
+        <w:lastRenderedPageBreak/>
+        <w:drawing>
+          <wp:inline distT="0" distB="0" distL="0" distR="0" wp14:anchorId="1775798D" wp14:editId="10C4E307">
+            <wp:extent cx="5608806" cy="7178662"/>
+            <wp:effectExtent l="0" t="0" r="0" b="3810"/>
+            <wp:docPr id="9" name="Imagem 9"/>
+            <wp:cNvGraphicFramePr>
+              <a:graphicFrameLocks xmlns:a="http://schemas.openxmlformats.org/drawingml/2006/main" noChangeAspect="1"/>
+            </wp:cNvGraphicFramePr>
+            <a:graphic xmlns:a="http://schemas.openxmlformats.org/drawingml/2006/main">
+              <a:graphicData uri="http://schemas.openxmlformats.org/drawingml/2006/picture">
+                <pic:pic xmlns:pic="http://schemas.openxmlformats.org/drawingml/2006/picture">
+                  <pic:nvPicPr>
+                    <pic:cNvPr id="1" name=""/>
+                    <pic:cNvPicPr/>
+                  </pic:nvPicPr>
+                  <pic:blipFill>
+                    <a:blip r:embed="rId15"/>
+                    <a:stretch>
+                      <a:fillRect/>
+                    </a:stretch>
+                  </pic:blipFill>
+                  <pic:spPr>
+                    <a:xfrm>
+                      <a:off x="0" y="0"/>
+                      <a:ext cx="5608806" cy="7178662"/>
+                    </a:xfrm>
+                    <a:prstGeom prst="rect">
+                      <a:avLst/>
+                    </a:prstGeom>
+                  </pic:spPr>
+                </pic:pic>
+              </a:graphicData>
+            </a:graphic>
+          </wp:inline>
+        </w:drawing>
+      </w:r>
       <w:bookmarkStart w:id="0" w:name="_GoBack"/>
       <w:bookmarkEnd w:id="0"/>
     </w:p>
+    <w:p/>
     <w:sectPr>
-      <w:headerReference w:type="default" r:id="rId12"/>
+      <w:headerReference w:type="default" r:id="rId16"/>
       <w:pgSz w:w="12240" w:h="15840"/>
       <w:pgMar w:top="720" w:right="720" w:bottom="720" w:left="720" w:header="708" w:footer="708" w:gutter="0"/>
       <w:cols w:space="708"/>

</xml_diff>

<commit_message>
atualizacao serie A e B
</commit_message>
<xml_diff>
--- a/anotacao/Rodadas e Classificação Brasileirão Série B 2026.docx
+++ b/anotacao/Rodadas e Classificação Brasileirão Série B 2026.docx
@@ -9,21 +9,12 @@
           <w:bCs/>
         </w:rPr>
       </w:pPr>
-      <w:proofErr w:type="spellStart"/>
-      <w:r>
-        <w:rPr>
-          <w:b/>
-          <w:bCs/>
-        </w:rPr>
-        <w:t>Rodada</w:t>
-      </w:r>
-      <w:proofErr w:type="spellEnd"/>
-      <w:r>
-        <w:rPr>
-          <w:b/>
-          <w:bCs/>
-        </w:rPr>
-        <w:t xml:space="preserve"> 01 – 22/03/2026</w:t>
+      <w:r>
+        <w:rPr>
+          <w:b/>
+          <w:bCs/>
+        </w:rPr>
+        <w:t>Rodada 01 – 22/03/2026</w:t>
       </w:r>
     </w:p>
     <w:p>
@@ -118,22 +109,13 @@
           <w:bCs/>
         </w:rPr>
       </w:pPr>
-      <w:proofErr w:type="spellStart"/>
       <w:r>
         <w:rPr>
           <w:b/>
           <w:bCs/>
         </w:rPr>
         <w:lastRenderedPageBreak/>
-        <w:t>Rodada</w:t>
-      </w:r>
-      <w:proofErr w:type="spellEnd"/>
-      <w:r>
-        <w:rPr>
-          <w:b/>
-          <w:bCs/>
-        </w:rPr>
-        <w:t xml:space="preserve"> 02 – 01/04/2026</w:t>
+        <w:t>Rodada 02 – 01/04/2026</w:t>
       </w:r>
     </w:p>
     <w:p>
@@ -228,21 +210,12 @@
           <w:bCs/>
         </w:rPr>
       </w:pPr>
-      <w:proofErr w:type="spellStart"/>
-      <w:r>
-        <w:rPr>
-          <w:b/>
-          <w:bCs/>
-        </w:rPr>
-        <w:t>Rodada</w:t>
-      </w:r>
-      <w:proofErr w:type="spellEnd"/>
-      <w:r>
-        <w:rPr>
-          <w:b/>
-          <w:bCs/>
-        </w:rPr>
-        <w:t xml:space="preserve"> 02 – 02/04/2026</w:t>
+      <w:r>
+        <w:rPr>
+          <w:b/>
+          <w:bCs/>
+        </w:rPr>
+        <w:t>Rodada 02 – 02/04/2026</w:t>
       </w:r>
     </w:p>
     <w:p>
@@ -338,21 +311,12 @@
           <w:bCs/>
         </w:rPr>
       </w:pPr>
-      <w:proofErr w:type="spellStart"/>
-      <w:r>
-        <w:rPr>
-          <w:b/>
-          <w:bCs/>
-        </w:rPr>
-        <w:t>Rodada</w:t>
-      </w:r>
-      <w:proofErr w:type="spellEnd"/>
-      <w:r>
-        <w:rPr>
-          <w:b/>
-          <w:bCs/>
-        </w:rPr>
-        <w:t xml:space="preserve"> 03 – 04/04/2026</w:t>
+      <w:r>
+        <w:rPr>
+          <w:b/>
+          <w:bCs/>
+        </w:rPr>
+        <w:t>Rodada 03 – 04/04/2026</w:t>
       </w:r>
     </w:p>
     <w:p>
@@ -443,21 +407,12 @@
       </w:r>
     </w:p>
     <w:p>
-      <w:proofErr w:type="spellStart"/>
-      <w:r>
-        <w:rPr>
-          <w:b/>
-          <w:bCs/>
-        </w:rPr>
-        <w:t>Rodada</w:t>
-      </w:r>
-      <w:proofErr w:type="spellEnd"/>
-      <w:r>
-        <w:rPr>
-          <w:b/>
-          <w:bCs/>
-        </w:rPr>
-        <w:t xml:space="preserve"> 03 – 04/04/2026 a 06/04/</w:t>
+      <w:r>
+        <w:rPr>
+          <w:b/>
+          <w:bCs/>
+        </w:rPr>
+        <w:t>Rodada 03 – 04/04/2026 a 06/04/</w:t>
       </w:r>
       <w:r>
         <w:t>2026</w:t>
@@ -556,21 +511,12 @@
           <w:bCs/>
         </w:rPr>
       </w:pPr>
-      <w:proofErr w:type="spellStart"/>
-      <w:r>
-        <w:rPr>
-          <w:b/>
-          <w:bCs/>
-        </w:rPr>
-        <w:t>Rodada</w:t>
-      </w:r>
-      <w:proofErr w:type="spellEnd"/>
-      <w:r>
-        <w:rPr>
-          <w:b/>
-          <w:bCs/>
-        </w:rPr>
-        <w:t xml:space="preserve"> </w:t>
+      <w:r>
+        <w:rPr>
+          <w:b/>
+          <w:bCs/>
+        </w:rPr>
+        <w:t xml:space="preserve">Rodada </w:t>
       </w:r>
       <w:r>
         <w:rPr>
@@ -673,21 +619,12 @@
           <w:bCs/>
         </w:rPr>
       </w:pPr>
-      <w:proofErr w:type="spellStart"/>
-      <w:r>
-        <w:rPr>
-          <w:b/>
-          <w:bCs/>
-        </w:rPr>
-        <w:t>Rodada</w:t>
-      </w:r>
-      <w:proofErr w:type="spellEnd"/>
-      <w:r>
-        <w:rPr>
-          <w:b/>
-          <w:bCs/>
-        </w:rPr>
-        <w:t xml:space="preserve"> 04 – 12/04/2026</w:t>
+      <w:r>
+        <w:rPr>
+          <w:b/>
+          <w:bCs/>
+        </w:rPr>
+        <w:t>Rodada 04 – 12/04/2026</w:t>
       </w:r>
     </w:p>
     <w:p>
@@ -783,26 +720,26 @@
           <w:bCs/>
         </w:rPr>
       </w:pPr>
-      <w:proofErr w:type="spellStart"/>
-      <w:r>
-        <w:rPr>
-          <w:b/>
-          <w:bCs/>
-        </w:rPr>
-        <w:t>Rodada</w:t>
-      </w:r>
-      <w:proofErr w:type="spellEnd"/>
-      <w:r>
-        <w:rPr>
-          <w:b/>
-          <w:bCs/>
-        </w:rPr>
-        <w:t xml:space="preserve"> 05 – 18/04/2026</w:t>
-      </w:r>
-    </w:p>
-    <w:p>
-      <w:r>
+      <w:r>
+        <w:rPr>
+          <w:b/>
+          <w:bCs/>
+        </w:rPr>
+        <w:t>Rodada 05 – 18/04/2026</w:t>
+      </w:r>
+    </w:p>
+    <w:p>
+      <w:r>
+        <w:rPr>
+          <w:noProof/>
+        </w:rPr>
         <w:lastRenderedPageBreak/>
+        <w:t>,</w:t>
+      </w:r>
+      <w:r>
+        <w:rPr>
+          <w:noProof/>
+        </w:rPr>
         <w:drawing>
           <wp:inline distT="0" distB="0" distL="0" distR="0" wp14:anchorId="0A425257" wp14:editId="7F54ADFF">
             <wp:extent cx="6858000" cy="6316345"/>
@@ -842,6 +779,9 @@
     </w:p>
     <w:p>
       <w:r>
+        <w:rPr>
+          <w:noProof/>
+        </w:rPr>
         <w:lastRenderedPageBreak/>
         <w:drawing>
           <wp:inline distT="0" distB="0" distL="0" distR="0" wp14:anchorId="66923278" wp14:editId="11A70C79">
@@ -887,29 +827,248 @@
           <w:bCs/>
         </w:rPr>
       </w:pPr>
-      <w:proofErr w:type="spellStart"/>
-      <w:r>
-        <w:rPr>
-          <w:b/>
-          <w:bCs/>
-        </w:rPr>
-        <w:t>Rodada</w:t>
-      </w:r>
-      <w:proofErr w:type="spellEnd"/>
-      <w:r>
-        <w:rPr>
-          <w:b/>
-          <w:bCs/>
-        </w:rPr>
-        <w:t xml:space="preserve"> 05 – 19/04/2026</w:t>
-      </w:r>
-    </w:p>
-    <w:p>
+      <w:r>
+        <w:rPr>
+          <w:b/>
+          <w:bCs/>
+        </w:rPr>
+        <w:t>Rodada 0</w:t>
+      </w:r>
+      <w:r>
+        <w:rPr>
+          <w:b/>
+          <w:bCs/>
+        </w:rPr>
+        <w:t>6</w:t>
+      </w:r>
+      <w:r>
+        <w:rPr>
+          <w:b/>
+          <w:bCs/>
+        </w:rPr>
+        <w:t xml:space="preserve"> – </w:t>
+      </w:r>
+      <w:r>
+        <w:rPr>
+          <w:b/>
+          <w:bCs/>
+        </w:rPr>
+        <w:t>22</w:t>
+      </w:r>
+      <w:r>
+        <w:rPr>
+          <w:b/>
+          <w:bCs/>
+        </w:rPr>
+        <w:t>/04/2026</w:t>
+      </w:r>
+    </w:p>
+    <w:p>
+      <w:r>
+        <w:rPr>
+          <w:noProof/>
+        </w:rPr>
+        <w:lastRenderedPageBreak/>
+        <w:drawing>
+          <wp:inline distT="0" distB="0" distL="0" distR="0" wp14:anchorId="1892DE61" wp14:editId="752D2E1D">
+            <wp:extent cx="6858000" cy="6349365"/>
+            <wp:effectExtent l="0" t="0" r="0" b="0"/>
+            <wp:docPr id="17" name="Imagem 17"/>
+            <wp:cNvGraphicFramePr>
+              <a:graphicFrameLocks xmlns:a="http://schemas.openxmlformats.org/drawingml/2006/main" noChangeAspect="1"/>
+            </wp:cNvGraphicFramePr>
+            <a:graphic xmlns:a="http://schemas.openxmlformats.org/drawingml/2006/main">
+              <a:graphicData uri="http://schemas.openxmlformats.org/drawingml/2006/picture">
+                <pic:pic xmlns:pic="http://schemas.openxmlformats.org/drawingml/2006/picture">
+                  <pic:nvPicPr>
+                    <pic:cNvPr id="1" name=""/>
+                    <pic:cNvPicPr/>
+                  </pic:nvPicPr>
+                  <pic:blipFill>
+                    <a:blip r:embed="rId22"/>
+                    <a:stretch>
+                      <a:fillRect/>
+                    </a:stretch>
+                  </pic:blipFill>
+                  <pic:spPr>
+                    <a:xfrm>
+                      <a:off x="0" y="0"/>
+                      <a:ext cx="6858000" cy="6349365"/>
+                    </a:xfrm>
+                    <a:prstGeom prst="rect">
+                      <a:avLst/>
+                    </a:prstGeom>
+                  </pic:spPr>
+                </pic:pic>
+              </a:graphicData>
+            </a:graphic>
+          </wp:inline>
+        </w:drawing>
+      </w:r>
+    </w:p>
+    <w:p/>
+    <w:p>
+      <w:r>
+        <w:rPr>
+          <w:noProof/>
+        </w:rPr>
+        <w:lastRenderedPageBreak/>
+        <w:drawing>
+          <wp:inline distT="0" distB="0" distL="0" distR="0" wp14:anchorId="1E655724" wp14:editId="2DFAD936">
+            <wp:extent cx="6858000" cy="8632190"/>
+            <wp:effectExtent l="0" t="0" r="0" b="0"/>
+            <wp:docPr id="16" name="Imagem 16" descr="Uma imagem contendo Tabela&#10;&#10;Descrição gerada automaticamente"/>
+            <wp:cNvGraphicFramePr>
+              <a:graphicFrameLocks xmlns:a="http://schemas.openxmlformats.org/drawingml/2006/main" noChangeAspect="1"/>
+            </wp:cNvGraphicFramePr>
+            <a:graphic xmlns:a="http://schemas.openxmlformats.org/drawingml/2006/main">
+              <a:graphicData uri="http://schemas.openxmlformats.org/drawingml/2006/picture">
+                <pic:pic xmlns:pic="http://schemas.openxmlformats.org/drawingml/2006/picture">
+                  <pic:nvPicPr>
+                    <pic:cNvPr id="1" name=""/>
+                    <pic:cNvPicPr/>
+                  </pic:nvPicPr>
+                  <pic:blipFill>
+                    <a:blip r:embed="rId23"/>
+                    <a:stretch>
+                      <a:fillRect/>
+                    </a:stretch>
+                  </pic:blipFill>
+                  <pic:spPr>
+                    <a:xfrm>
+                      <a:off x="0" y="0"/>
+                      <a:ext cx="6858000" cy="8632190"/>
+                    </a:xfrm>
+                    <a:prstGeom prst="rect">
+                      <a:avLst/>
+                    </a:prstGeom>
+                  </pic:spPr>
+                </pic:pic>
+              </a:graphicData>
+            </a:graphic>
+          </wp:inline>
+        </w:drawing>
+      </w:r>
+    </w:p>
+    <w:p>
+      <w:pPr>
+        <w:rPr>
+          <w:b/>
+          <w:bCs/>
+        </w:rPr>
+      </w:pPr>
+      <w:r>
+        <w:rPr>
+          <w:b/>
+          <w:bCs/>
+        </w:rPr>
+        <w:t>Rodada 7 – 02/05/2026</w:t>
+      </w:r>
+    </w:p>
+    <w:p>
+      <w:pPr>
+        <w:rPr>
+          <w:b/>
+          <w:bCs/>
+        </w:rPr>
+      </w:pPr>
+      <w:r>
+        <w:rPr>
+          <w:b/>
+          <w:bCs/>
+        </w:rPr>
+        <w:lastRenderedPageBreak/>
+        <w:drawing>
+          <wp:inline distT="0" distB="0" distL="0" distR="0" wp14:anchorId="3E4F86CB" wp14:editId="5C7338D9">
+            <wp:extent cx="6858000" cy="6226175"/>
+            <wp:effectExtent l="0" t="0" r="0" b="3175"/>
+            <wp:docPr id="18" name="Imagem 18" descr="Uma imagem contendo Interface gráfica do usuário&#10;&#10;Descrição gerada automaticamente"/>
+            <wp:cNvGraphicFramePr>
+              <a:graphicFrameLocks xmlns:a="http://schemas.openxmlformats.org/drawingml/2006/main" noChangeAspect="1"/>
+            </wp:cNvGraphicFramePr>
+            <a:graphic xmlns:a="http://schemas.openxmlformats.org/drawingml/2006/main">
+              <a:graphicData uri="http://schemas.openxmlformats.org/drawingml/2006/picture">
+                <pic:pic xmlns:pic="http://schemas.openxmlformats.org/drawingml/2006/picture">
+                  <pic:nvPicPr>
+                    <pic:cNvPr id="1" name=""/>
+                    <pic:cNvPicPr/>
+                  </pic:nvPicPr>
+                  <pic:blipFill>
+                    <a:blip r:embed="rId24"/>
+                    <a:stretch>
+                      <a:fillRect/>
+                    </a:stretch>
+                  </pic:blipFill>
+                  <pic:spPr>
+                    <a:xfrm>
+                      <a:off x="0" y="0"/>
+                      <a:ext cx="6858000" cy="6226175"/>
+                    </a:xfrm>
+                    <a:prstGeom prst="rect">
+                      <a:avLst/>
+                    </a:prstGeom>
+                  </pic:spPr>
+                </pic:pic>
+              </a:graphicData>
+            </a:graphic>
+          </wp:inline>
+        </w:drawing>
+      </w:r>
+    </w:p>
+    <w:p>
+      <w:pPr>
+        <w:rPr>
+          <w:b/>
+          <w:bCs/>
+        </w:rPr>
+      </w:pPr>
+      <w:r>
+        <w:rPr>
+          <w:b/>
+          <w:bCs/>
+        </w:rPr>
+        <w:lastRenderedPageBreak/>
+        <w:drawing>
+          <wp:inline distT="0" distB="0" distL="0" distR="0" wp14:anchorId="21FB29BE" wp14:editId="6F866F7C">
+            <wp:extent cx="6858000" cy="8729345"/>
+            <wp:effectExtent l="0" t="0" r="0" b="0"/>
+            <wp:docPr id="19" name="Imagem 19"/>
+            <wp:cNvGraphicFramePr>
+              <a:graphicFrameLocks xmlns:a="http://schemas.openxmlformats.org/drawingml/2006/main" noChangeAspect="1"/>
+            </wp:cNvGraphicFramePr>
+            <a:graphic xmlns:a="http://schemas.openxmlformats.org/drawingml/2006/main">
+              <a:graphicData uri="http://schemas.openxmlformats.org/drawingml/2006/picture">
+                <pic:pic xmlns:pic="http://schemas.openxmlformats.org/drawingml/2006/picture">
+                  <pic:nvPicPr>
+                    <pic:cNvPr id="1" name=""/>
+                    <pic:cNvPicPr/>
+                  </pic:nvPicPr>
+                  <pic:blipFill>
+                    <a:blip r:embed="rId25"/>
+                    <a:stretch>
+                      <a:fillRect/>
+                    </a:stretch>
+                  </pic:blipFill>
+                  <pic:spPr>
+                    <a:xfrm>
+                      <a:off x="0" y="0"/>
+                      <a:ext cx="6858000" cy="8729345"/>
+                    </a:xfrm>
+                    <a:prstGeom prst="rect">
+                      <a:avLst/>
+                    </a:prstGeom>
+                  </pic:spPr>
+                </pic:pic>
+              </a:graphicData>
+            </a:graphic>
+          </wp:inline>
+        </w:drawing>
+      </w:r>
       <w:bookmarkStart w:id="0" w:name="_GoBack"/>
       <w:bookmarkEnd w:id="0"/>
     </w:p>
     <w:sectPr>
-      <w:headerReference w:type="default" r:id="rId22"/>
+      <w:headerReference w:type="default" r:id="rId26"/>
       <w:pgSz w:w="12240" w:h="15840"/>
       <w:pgMar w:top="720" w:right="720" w:bottom="720" w:left="720" w:header="708" w:footer="708" w:gutter="0"/>
       <w:cols w:space="708"/>

</xml_diff>

<commit_message>
Atualizacao rodada 18 serie A rodada 11 serie B
</commit_message>
<xml_diff>
--- a/anotacao/Rodadas e Classificação Brasileirão Série B 2026.docx
+++ b/anotacao/Rodadas e Classificação Brasileirão Série B 2026.docx
@@ -976,6 +976,7 @@
         <w:rPr>
           <w:b/>
           <w:bCs/>
+          <w:noProof/>
         </w:rPr>
         <w:lastRenderedPageBreak/>
         <w:drawing>
@@ -1026,6 +1027,7 @@
         <w:rPr>
           <w:b/>
           <w:bCs/>
+          <w:noProof/>
         </w:rPr>
         <w:lastRenderedPageBreak/>
         <w:drawing>
@@ -1064,11 +1066,721 @@
           </wp:inline>
         </w:drawing>
       </w:r>
+    </w:p>
+    <w:p>
+      <w:pPr>
+        <w:rPr>
+          <w:b/>
+          <w:bCs/>
+        </w:rPr>
+      </w:pPr>
+      <w:r>
+        <w:rPr>
+          <w:b/>
+          <w:bCs/>
+        </w:rPr>
+        <w:lastRenderedPageBreak/>
+        <w:t>Rodada 07 – 03/05/2026</w:t>
+      </w:r>
+    </w:p>
+    <w:p>
+      <w:pPr>
+        <w:rPr>
+          <w:b/>
+          <w:bCs/>
+        </w:rPr>
+      </w:pPr>
+      <w:r>
+        <w:rPr>
+          <w:b/>
+          <w:bCs/>
+          <w:noProof/>
+        </w:rPr>
+        <w:drawing>
+          <wp:inline distT="0" distB="0" distL="0" distR="0" wp14:anchorId="4097BED1" wp14:editId="2D86FCE9">
+            <wp:extent cx="6858000" cy="6186170"/>
+            <wp:effectExtent l="0" t="0" r="0" b="5080"/>
+            <wp:docPr id="20" name="Imagem 20" descr="Uma imagem contendo Interface gráfica do usuário&#10;&#10;Descrição gerada automaticamente"/>
+            <wp:cNvGraphicFramePr>
+              <a:graphicFrameLocks xmlns:a="http://schemas.openxmlformats.org/drawingml/2006/main" noChangeAspect="1"/>
+            </wp:cNvGraphicFramePr>
+            <a:graphic xmlns:a="http://schemas.openxmlformats.org/drawingml/2006/main">
+              <a:graphicData uri="http://schemas.openxmlformats.org/drawingml/2006/picture">
+                <pic:pic xmlns:pic="http://schemas.openxmlformats.org/drawingml/2006/picture">
+                  <pic:nvPicPr>
+                    <pic:cNvPr id="1" name=""/>
+                    <pic:cNvPicPr/>
+                  </pic:nvPicPr>
+                  <pic:blipFill>
+                    <a:blip r:embed="rId26"/>
+                    <a:stretch>
+                      <a:fillRect/>
+                    </a:stretch>
+                  </pic:blipFill>
+                  <pic:spPr>
+                    <a:xfrm>
+                      <a:off x="0" y="0"/>
+                      <a:ext cx="6858000" cy="6186170"/>
+                    </a:xfrm>
+                    <a:prstGeom prst="rect">
+                      <a:avLst/>
+                    </a:prstGeom>
+                  </pic:spPr>
+                </pic:pic>
+              </a:graphicData>
+            </a:graphic>
+          </wp:inline>
+        </w:drawing>
+      </w:r>
+    </w:p>
+    <w:p>
+      <w:pPr>
+        <w:rPr>
+          <w:b/>
+          <w:bCs/>
+        </w:rPr>
+      </w:pPr>
+      <w:r>
+        <w:rPr>
+          <w:b/>
+          <w:bCs/>
+          <w:noProof/>
+        </w:rPr>
+        <w:lastRenderedPageBreak/>
+        <w:drawing>
+          <wp:inline distT="0" distB="0" distL="0" distR="0" wp14:anchorId="2B02E4FC" wp14:editId="29176BD8">
+            <wp:extent cx="5806943" cy="7216765"/>
+            <wp:effectExtent l="0" t="0" r="3810" b="3810"/>
+            <wp:docPr id="21" name="Imagem 21" descr="Uma imagem contendo Tabela&#10;&#10;Descrição gerada automaticamente"/>
+            <wp:cNvGraphicFramePr>
+              <a:graphicFrameLocks xmlns:a="http://schemas.openxmlformats.org/drawingml/2006/main" noChangeAspect="1"/>
+            </wp:cNvGraphicFramePr>
+            <a:graphic xmlns:a="http://schemas.openxmlformats.org/drawingml/2006/main">
+              <a:graphicData uri="http://schemas.openxmlformats.org/drawingml/2006/picture">
+                <pic:pic xmlns:pic="http://schemas.openxmlformats.org/drawingml/2006/picture">
+                  <pic:nvPicPr>
+                    <pic:cNvPr id="1" name=""/>
+                    <pic:cNvPicPr/>
+                  </pic:nvPicPr>
+                  <pic:blipFill>
+                    <a:blip r:embed="rId27"/>
+                    <a:stretch>
+                      <a:fillRect/>
+                    </a:stretch>
+                  </pic:blipFill>
+                  <pic:spPr>
+                    <a:xfrm>
+                      <a:off x="0" y="0"/>
+                      <a:ext cx="5806943" cy="7216765"/>
+                    </a:xfrm>
+                    <a:prstGeom prst="rect">
+                      <a:avLst/>
+                    </a:prstGeom>
+                  </pic:spPr>
+                </pic:pic>
+              </a:graphicData>
+            </a:graphic>
+          </wp:inline>
+        </w:drawing>
+      </w:r>
+    </w:p>
+    <w:p>
+      <w:pPr>
+        <w:rPr>
+          <w:b/>
+          <w:bCs/>
+        </w:rPr>
+      </w:pPr>
+      <w:r>
+        <w:rPr>
+          <w:b/>
+          <w:bCs/>
+        </w:rPr>
+        <w:t>Rodada 09 – 17/05/2026</w:t>
+      </w:r>
+    </w:p>
+    <w:p>
+      <w:pPr>
+        <w:rPr>
+          <w:b/>
+          <w:bCs/>
+        </w:rPr>
+      </w:pPr>
+      <w:r>
+        <w:rPr>
+          <w:b/>
+          <w:bCs/>
+          <w:noProof/>
+        </w:rPr>
+        <w:lastRenderedPageBreak/>
+        <w:drawing>
+          <wp:inline distT="0" distB="0" distL="0" distR="0" wp14:anchorId="28000091" wp14:editId="1286227F">
+            <wp:extent cx="6858000" cy="6291580"/>
+            <wp:effectExtent l="0" t="0" r="0" b="0"/>
+            <wp:docPr id="22" name="Imagem 22" descr="Uma imagem contendo Interface gráfica do usuário&#10;&#10;Descrição gerada automaticamente"/>
+            <wp:cNvGraphicFramePr>
+              <a:graphicFrameLocks xmlns:a="http://schemas.openxmlformats.org/drawingml/2006/main" noChangeAspect="1"/>
+            </wp:cNvGraphicFramePr>
+            <a:graphic xmlns:a="http://schemas.openxmlformats.org/drawingml/2006/main">
+              <a:graphicData uri="http://schemas.openxmlformats.org/drawingml/2006/picture">
+                <pic:pic xmlns:pic="http://schemas.openxmlformats.org/drawingml/2006/picture">
+                  <pic:nvPicPr>
+                    <pic:cNvPr id="1" name=""/>
+                    <pic:cNvPicPr/>
+                  </pic:nvPicPr>
+                  <pic:blipFill>
+                    <a:blip r:embed="rId28"/>
+                    <a:stretch>
+                      <a:fillRect/>
+                    </a:stretch>
+                  </pic:blipFill>
+                  <pic:spPr>
+                    <a:xfrm>
+                      <a:off x="0" y="0"/>
+                      <a:ext cx="6858000" cy="6291580"/>
+                    </a:xfrm>
+                    <a:prstGeom prst="rect">
+                      <a:avLst/>
+                    </a:prstGeom>
+                  </pic:spPr>
+                </pic:pic>
+              </a:graphicData>
+            </a:graphic>
+          </wp:inline>
+        </w:drawing>
+      </w:r>
+    </w:p>
+    <w:p>
+      <w:pPr>
+        <w:rPr>
+          <w:b/>
+          <w:bCs/>
+        </w:rPr>
+      </w:pPr>
+      <w:r>
+        <w:rPr>
+          <w:b/>
+          <w:bCs/>
+          <w:noProof/>
+        </w:rPr>
+        <w:lastRenderedPageBreak/>
+        <w:drawing>
+          <wp:inline distT="0" distB="0" distL="0" distR="0" wp14:anchorId="2F199989" wp14:editId="0423F4AA">
+            <wp:extent cx="6792273" cy="8973802"/>
+            <wp:effectExtent l="0" t="0" r="8890" b="0"/>
+            <wp:docPr id="23" name="Imagem 23" descr="Uma imagem contendo Tabela&#10;&#10;Descrição gerada automaticamente"/>
+            <wp:cNvGraphicFramePr>
+              <a:graphicFrameLocks xmlns:a="http://schemas.openxmlformats.org/drawingml/2006/main" noChangeAspect="1"/>
+            </wp:cNvGraphicFramePr>
+            <a:graphic xmlns:a="http://schemas.openxmlformats.org/drawingml/2006/main">
+              <a:graphicData uri="http://schemas.openxmlformats.org/drawingml/2006/picture">
+                <pic:pic xmlns:pic="http://schemas.openxmlformats.org/drawingml/2006/picture">
+                  <pic:nvPicPr>
+                    <pic:cNvPr id="1" name=""/>
+                    <pic:cNvPicPr/>
+                  </pic:nvPicPr>
+                  <pic:blipFill>
+                    <a:blip r:embed="rId29"/>
+                    <a:stretch>
+                      <a:fillRect/>
+                    </a:stretch>
+                  </pic:blipFill>
+                  <pic:spPr>
+                    <a:xfrm>
+                      <a:off x="0" y="0"/>
+                      <a:ext cx="6792273" cy="8973802"/>
+                    </a:xfrm>
+                    <a:prstGeom prst="rect">
+                      <a:avLst/>
+                    </a:prstGeom>
+                  </pic:spPr>
+                </pic:pic>
+              </a:graphicData>
+            </a:graphic>
+          </wp:inline>
+        </w:drawing>
+      </w:r>
+    </w:p>
+    <w:p>
+      <w:pPr>
+        <w:rPr>
+          <w:b/>
+          <w:bCs/>
+        </w:rPr>
+      </w:pPr>
+      <w:r>
+        <w:rPr>
+          <w:b/>
+          <w:bCs/>
+        </w:rPr>
+        <w:lastRenderedPageBreak/>
+        <w:t>Rodada 10 – 22/05/2026</w:t>
+      </w:r>
+    </w:p>
+    <w:p>
+      <w:pPr>
+        <w:rPr>
+          <w:b/>
+          <w:bCs/>
+        </w:rPr>
+      </w:pPr>
+      <w:r>
+        <w:rPr>
+          <w:b/>
+          <w:bCs/>
+          <w:noProof/>
+        </w:rPr>
+        <w:drawing>
+          <wp:inline distT="0" distB="0" distL="0" distR="0" wp14:anchorId="5B91A335" wp14:editId="2C8E1288">
+            <wp:extent cx="6858000" cy="6336665"/>
+            <wp:effectExtent l="0" t="0" r="0" b="6985"/>
+            <wp:docPr id="24" name="Imagem 24"/>
+            <wp:cNvGraphicFramePr>
+              <a:graphicFrameLocks xmlns:a="http://schemas.openxmlformats.org/drawingml/2006/main" noChangeAspect="1"/>
+            </wp:cNvGraphicFramePr>
+            <a:graphic xmlns:a="http://schemas.openxmlformats.org/drawingml/2006/main">
+              <a:graphicData uri="http://schemas.openxmlformats.org/drawingml/2006/picture">
+                <pic:pic xmlns:pic="http://schemas.openxmlformats.org/drawingml/2006/picture">
+                  <pic:nvPicPr>
+                    <pic:cNvPr id="1" name=""/>
+                    <pic:cNvPicPr/>
+                  </pic:nvPicPr>
+                  <pic:blipFill>
+                    <a:blip r:embed="rId30"/>
+                    <a:stretch>
+                      <a:fillRect/>
+                    </a:stretch>
+                  </pic:blipFill>
+                  <pic:spPr>
+                    <a:xfrm>
+                      <a:off x="0" y="0"/>
+                      <a:ext cx="6858000" cy="6336665"/>
+                    </a:xfrm>
+                    <a:prstGeom prst="rect">
+                      <a:avLst/>
+                    </a:prstGeom>
+                  </pic:spPr>
+                </pic:pic>
+              </a:graphicData>
+            </a:graphic>
+          </wp:inline>
+        </w:drawing>
+      </w:r>
+    </w:p>
+    <w:p>
+      <w:pPr>
+        <w:rPr>
+          <w:b/>
+          <w:bCs/>
+        </w:rPr>
+      </w:pPr>
+      <w:r>
+        <w:rPr>
+          <w:b/>
+          <w:bCs/>
+          <w:noProof/>
+        </w:rPr>
+        <w:lastRenderedPageBreak/>
+        <w:drawing>
+          <wp:inline distT="0" distB="0" distL="0" distR="0" wp14:anchorId="1B52A853" wp14:editId="0DA5167D">
+            <wp:extent cx="6858000" cy="8588375"/>
+            <wp:effectExtent l="0" t="0" r="0" b="3175"/>
+            <wp:docPr id="25" name="Imagem 25" descr="Uma imagem contendo Tabela&#10;&#10;Descrição gerada automaticamente"/>
+            <wp:cNvGraphicFramePr>
+              <a:graphicFrameLocks xmlns:a="http://schemas.openxmlformats.org/drawingml/2006/main" noChangeAspect="1"/>
+            </wp:cNvGraphicFramePr>
+            <a:graphic xmlns:a="http://schemas.openxmlformats.org/drawingml/2006/main">
+              <a:graphicData uri="http://schemas.openxmlformats.org/drawingml/2006/picture">
+                <pic:pic xmlns:pic="http://schemas.openxmlformats.org/drawingml/2006/picture">
+                  <pic:nvPicPr>
+                    <pic:cNvPr id="1" name=""/>
+                    <pic:cNvPicPr/>
+                  </pic:nvPicPr>
+                  <pic:blipFill>
+                    <a:blip r:embed="rId31"/>
+                    <a:stretch>
+                      <a:fillRect/>
+                    </a:stretch>
+                  </pic:blipFill>
+                  <pic:spPr>
+                    <a:xfrm>
+                      <a:off x="0" y="0"/>
+                      <a:ext cx="6858000" cy="8588375"/>
+                    </a:xfrm>
+                    <a:prstGeom prst="rect">
+                      <a:avLst/>
+                    </a:prstGeom>
+                  </pic:spPr>
+                </pic:pic>
+              </a:graphicData>
+            </a:graphic>
+          </wp:inline>
+        </w:drawing>
+      </w:r>
+    </w:p>
+    <w:p>
+      <w:pPr>
+        <w:rPr>
+          <w:b/>
+          <w:bCs/>
+        </w:rPr>
+      </w:pPr>
+      <w:r>
+        <w:rPr>
+          <w:b/>
+          <w:bCs/>
+        </w:rPr>
+        <w:t>Rodada 10 – 23/05/2026</w:t>
+      </w:r>
+    </w:p>
+    <w:p>
+      <w:pPr>
+        <w:rPr>
+          <w:b/>
+          <w:bCs/>
+        </w:rPr>
+      </w:pPr>
+      <w:r>
+        <w:rPr>
+          <w:b/>
+          <w:bCs/>
+          <w:noProof/>
+        </w:rPr>
+        <w:lastRenderedPageBreak/>
+        <w:drawing>
+          <wp:inline distT="0" distB="0" distL="0" distR="0" wp14:anchorId="458A2FE9" wp14:editId="622E3CBA">
+            <wp:extent cx="6858000" cy="6125210"/>
+            <wp:effectExtent l="0" t="0" r="0" b="8890"/>
+            <wp:docPr id="26" name="Imagem 26" descr="Uma imagem contendo Tabela&#10;&#10;Descrição gerada automaticamente"/>
+            <wp:cNvGraphicFramePr>
+              <a:graphicFrameLocks xmlns:a="http://schemas.openxmlformats.org/drawingml/2006/main" noChangeAspect="1"/>
+            </wp:cNvGraphicFramePr>
+            <a:graphic xmlns:a="http://schemas.openxmlformats.org/drawingml/2006/main">
+              <a:graphicData uri="http://schemas.openxmlformats.org/drawingml/2006/picture">
+                <pic:pic xmlns:pic="http://schemas.openxmlformats.org/drawingml/2006/picture">
+                  <pic:nvPicPr>
+                    <pic:cNvPr id="1" name=""/>
+                    <pic:cNvPicPr/>
+                  </pic:nvPicPr>
+                  <pic:blipFill>
+                    <a:blip r:embed="rId32"/>
+                    <a:stretch>
+                      <a:fillRect/>
+                    </a:stretch>
+                  </pic:blipFill>
+                  <pic:spPr>
+                    <a:xfrm>
+                      <a:off x="0" y="0"/>
+                      <a:ext cx="6858000" cy="6125210"/>
+                    </a:xfrm>
+                    <a:prstGeom prst="rect">
+                      <a:avLst/>
+                    </a:prstGeom>
+                  </pic:spPr>
+                </pic:pic>
+              </a:graphicData>
+            </a:graphic>
+          </wp:inline>
+        </w:drawing>
+      </w:r>
+    </w:p>
+    <w:p>
+      <w:pPr>
+        <w:rPr>
+          <w:b/>
+          <w:bCs/>
+        </w:rPr>
+      </w:pPr>
+      <w:r>
+        <w:rPr>
+          <w:b/>
+          <w:bCs/>
+          <w:noProof/>
+        </w:rPr>
+        <w:lastRenderedPageBreak/>
+        <w:drawing>
+          <wp:inline distT="0" distB="0" distL="0" distR="0" wp14:anchorId="56555A0D" wp14:editId="50009A92">
+            <wp:extent cx="6858000" cy="8750300"/>
+            <wp:effectExtent l="0" t="0" r="0" b="0"/>
+            <wp:docPr id="27" name="Imagem 27" descr="Uma imagem contendo Tabela&#10;&#10;Descrição gerada automaticamente"/>
+            <wp:cNvGraphicFramePr>
+              <a:graphicFrameLocks xmlns:a="http://schemas.openxmlformats.org/drawingml/2006/main" noChangeAspect="1"/>
+            </wp:cNvGraphicFramePr>
+            <a:graphic xmlns:a="http://schemas.openxmlformats.org/drawingml/2006/main">
+              <a:graphicData uri="http://schemas.openxmlformats.org/drawingml/2006/picture">
+                <pic:pic xmlns:pic="http://schemas.openxmlformats.org/drawingml/2006/picture">
+                  <pic:nvPicPr>
+                    <pic:cNvPr id="1" name=""/>
+                    <pic:cNvPicPr/>
+                  </pic:nvPicPr>
+                  <pic:blipFill>
+                    <a:blip r:embed="rId33"/>
+                    <a:stretch>
+                      <a:fillRect/>
+                    </a:stretch>
+                  </pic:blipFill>
+                  <pic:spPr>
+                    <a:xfrm>
+                      <a:off x="0" y="0"/>
+                      <a:ext cx="6858000" cy="8750300"/>
+                    </a:xfrm>
+                    <a:prstGeom prst="rect">
+                      <a:avLst/>
+                    </a:prstGeom>
+                  </pic:spPr>
+                </pic:pic>
+              </a:graphicData>
+            </a:graphic>
+          </wp:inline>
+        </w:drawing>
+      </w:r>
+    </w:p>
+    <w:p>
+      <w:pPr>
+        <w:rPr>
+          <w:b/>
+          <w:bCs/>
+          <w:lang w:val="pt-BR"/>
+        </w:rPr>
+      </w:pPr>
+      <w:r>
+        <w:rPr>
+          <w:b/>
+          <w:bCs/>
+          <w:lang w:val="pt-BR"/>
+        </w:rPr>
+        <w:lastRenderedPageBreak/>
+        <w:t>Rodada 10 – 24/05/2026</w:t>
+      </w:r>
+    </w:p>
+    <w:p>
+      <w:pPr>
+        <w:rPr>
+          <w:b/>
+          <w:bCs/>
+        </w:rPr>
+      </w:pPr>
+      <w:r>
+        <w:rPr>
+          <w:b/>
+          <w:bCs/>
+          <w:noProof/>
+        </w:rPr>
+        <w:drawing>
+          <wp:inline distT="0" distB="0" distL="0" distR="0" wp14:anchorId="0DEDE0B6" wp14:editId="2702BCB7">
+            <wp:extent cx="6858000" cy="6223000"/>
+            <wp:effectExtent l="0" t="0" r="0" b="6350"/>
+            <wp:docPr id="28" name="Imagem 28" descr="Uma imagem contendo Aplicativo&#10;&#10;Descrição gerada automaticamente"/>
+            <wp:cNvGraphicFramePr>
+              <a:graphicFrameLocks xmlns:a="http://schemas.openxmlformats.org/drawingml/2006/main" noChangeAspect="1"/>
+            </wp:cNvGraphicFramePr>
+            <a:graphic xmlns:a="http://schemas.openxmlformats.org/drawingml/2006/main">
+              <a:graphicData uri="http://schemas.openxmlformats.org/drawingml/2006/picture">
+                <pic:pic xmlns:pic="http://schemas.openxmlformats.org/drawingml/2006/picture">
+                  <pic:nvPicPr>
+                    <pic:cNvPr id="1" name=""/>
+                    <pic:cNvPicPr/>
+                  </pic:nvPicPr>
+                  <pic:blipFill>
+                    <a:blip r:embed="rId34"/>
+                    <a:stretch>
+                      <a:fillRect/>
+                    </a:stretch>
+                  </pic:blipFill>
+                  <pic:spPr>
+                    <a:xfrm>
+                      <a:off x="0" y="0"/>
+                      <a:ext cx="6858000" cy="6223000"/>
+                    </a:xfrm>
+                    <a:prstGeom prst="rect">
+                      <a:avLst/>
+                    </a:prstGeom>
+                  </pic:spPr>
+                </pic:pic>
+              </a:graphicData>
+            </a:graphic>
+          </wp:inline>
+        </w:drawing>
+      </w:r>
+    </w:p>
+    <w:p>
+      <w:pPr>
+        <w:rPr>
+          <w:b/>
+          <w:bCs/>
+        </w:rPr>
+      </w:pPr>
+      <w:r>
+        <w:rPr>
+          <w:b/>
+          <w:bCs/>
+          <w:noProof/>
+        </w:rPr>
+        <w:lastRenderedPageBreak/>
+        <w:drawing>
+          <wp:inline distT="0" distB="0" distL="0" distR="0" wp14:anchorId="5948DD74" wp14:editId="4BCBB8AB">
+            <wp:extent cx="6858000" cy="8595360"/>
+            <wp:effectExtent l="0" t="0" r="0" b="0"/>
+            <wp:docPr id="29" name="Imagem 29" descr="Uma imagem contendo Tabela&#10;&#10;Descrição gerada automaticamente"/>
+            <wp:cNvGraphicFramePr>
+              <a:graphicFrameLocks xmlns:a="http://schemas.openxmlformats.org/drawingml/2006/main" noChangeAspect="1"/>
+            </wp:cNvGraphicFramePr>
+            <a:graphic xmlns:a="http://schemas.openxmlformats.org/drawingml/2006/main">
+              <a:graphicData uri="http://schemas.openxmlformats.org/drawingml/2006/picture">
+                <pic:pic xmlns:pic="http://schemas.openxmlformats.org/drawingml/2006/picture">
+                  <pic:nvPicPr>
+                    <pic:cNvPr id="1" name=""/>
+                    <pic:cNvPicPr/>
+                  </pic:nvPicPr>
+                  <pic:blipFill>
+                    <a:blip r:embed="rId35"/>
+                    <a:stretch>
+                      <a:fillRect/>
+                    </a:stretch>
+                  </pic:blipFill>
+                  <pic:spPr>
+                    <a:xfrm>
+                      <a:off x="0" y="0"/>
+                      <a:ext cx="6858000" cy="8595360"/>
+                    </a:xfrm>
+                    <a:prstGeom prst="rect">
+                      <a:avLst/>
+                    </a:prstGeom>
+                  </pic:spPr>
+                </pic:pic>
+              </a:graphicData>
+            </a:graphic>
+          </wp:inline>
+        </w:drawing>
+      </w:r>
+    </w:p>
+    <w:p>
+      <w:pPr>
+        <w:rPr>
+          <w:b/>
+          <w:bCs/>
+        </w:rPr>
+      </w:pPr>
+      <w:r>
+        <w:rPr>
+          <w:b/>
+          <w:bCs/>
+        </w:rPr>
+        <w:t>Rodada 10 – 25/05/2026</w:t>
+      </w:r>
+    </w:p>
+    <w:p>
+      <w:pPr>
+        <w:rPr>
+          <w:b/>
+          <w:bCs/>
+        </w:rPr>
+      </w:pPr>
+      <w:r>
+        <w:rPr>
+          <w:b/>
+          <w:bCs/>
+        </w:rPr>
+        <w:lastRenderedPageBreak/>
+        <w:drawing>
+          <wp:inline distT="0" distB="0" distL="0" distR="0" wp14:anchorId="269B567F" wp14:editId="6235D18C">
+            <wp:extent cx="6858000" cy="6342380"/>
+            <wp:effectExtent l="0" t="0" r="0" b="1270"/>
+            <wp:docPr id="30" name="Imagem 30" descr="Uma imagem contendo Interface gráfica do usuário&#10;&#10;Descrição gerada automaticamente"/>
+            <wp:cNvGraphicFramePr>
+              <a:graphicFrameLocks xmlns:a="http://schemas.openxmlformats.org/drawingml/2006/main" noChangeAspect="1"/>
+            </wp:cNvGraphicFramePr>
+            <a:graphic xmlns:a="http://schemas.openxmlformats.org/drawingml/2006/main">
+              <a:graphicData uri="http://schemas.openxmlformats.org/drawingml/2006/picture">
+                <pic:pic xmlns:pic="http://schemas.openxmlformats.org/drawingml/2006/picture">
+                  <pic:nvPicPr>
+                    <pic:cNvPr id="1" name=""/>
+                    <pic:cNvPicPr/>
+                  </pic:nvPicPr>
+                  <pic:blipFill>
+                    <a:blip r:embed="rId36"/>
+                    <a:stretch>
+                      <a:fillRect/>
+                    </a:stretch>
+                  </pic:blipFill>
+                  <pic:spPr>
+                    <a:xfrm>
+                      <a:off x="0" y="0"/>
+                      <a:ext cx="6858000" cy="6342380"/>
+                    </a:xfrm>
+                    <a:prstGeom prst="rect">
+                      <a:avLst/>
+                    </a:prstGeom>
+                  </pic:spPr>
+                </pic:pic>
+              </a:graphicData>
+            </a:graphic>
+          </wp:inline>
+        </w:drawing>
+      </w:r>
+    </w:p>
+    <w:p>
+      <w:pPr>
+        <w:rPr>
+          <w:b/>
+          <w:bCs/>
+        </w:rPr>
+      </w:pPr>
+      <w:r>
+        <w:rPr>
+          <w:b/>
+          <w:bCs/>
+        </w:rPr>
+        <w:lastRenderedPageBreak/>
+        <w:drawing>
+          <wp:inline distT="0" distB="0" distL="0" distR="0" wp14:anchorId="103370BA" wp14:editId="03779DF4">
+            <wp:extent cx="6858000" cy="8639175"/>
+            <wp:effectExtent l="0" t="0" r="0" b="9525"/>
+            <wp:docPr id="31" name="Imagem 31" descr="Uma imagem contendo Tabela&#10;&#10;Descrição gerada automaticamente"/>
+            <wp:cNvGraphicFramePr>
+              <a:graphicFrameLocks xmlns:a="http://schemas.openxmlformats.org/drawingml/2006/main" noChangeAspect="1"/>
+            </wp:cNvGraphicFramePr>
+            <a:graphic xmlns:a="http://schemas.openxmlformats.org/drawingml/2006/main">
+              <a:graphicData uri="http://schemas.openxmlformats.org/drawingml/2006/picture">
+                <pic:pic xmlns:pic="http://schemas.openxmlformats.org/drawingml/2006/picture">
+                  <pic:nvPicPr>
+                    <pic:cNvPr id="1" name=""/>
+                    <pic:cNvPicPr/>
+                  </pic:nvPicPr>
+                  <pic:blipFill>
+                    <a:blip r:embed="rId37"/>
+                    <a:stretch>
+                      <a:fillRect/>
+                    </a:stretch>
+                  </pic:blipFill>
+                  <pic:spPr>
+                    <a:xfrm>
+                      <a:off x="0" y="0"/>
+                      <a:ext cx="6858000" cy="8639175"/>
+                    </a:xfrm>
+                    <a:prstGeom prst="rect">
+                      <a:avLst/>
+                    </a:prstGeom>
+                  </pic:spPr>
+                </pic:pic>
+              </a:graphicData>
+            </a:graphic>
+          </wp:inline>
+        </w:drawing>
+      </w:r>
       <w:bookmarkStart w:id="0" w:name="_GoBack"/>
       <w:bookmarkEnd w:id="0"/>
     </w:p>
+    <w:p>
+      <w:pPr>
+        <w:rPr>
+          <w:b/>
+          <w:bCs/>
+        </w:rPr>
+      </w:pPr>
+    </w:p>
     <w:sectPr>
-      <w:headerReference w:type="default" r:id="rId26"/>
+      <w:headerReference w:type="default" r:id="rId38"/>
       <w:pgSz w:w="12240" w:h="15840"/>
       <w:pgMar w:top="720" w:right="720" w:bottom="720" w:left="720" w:header="708" w:footer="708" w:gutter="0"/>
       <w:cols w:space="708"/>

</xml_diff>